<commit_message>
Update advertising services acceptance certificate template
Replit-Commit-Author: Agent
</commit_message>
<xml_diff>
--- a/templates/working/Акт_приемки_рекламных_услуг.docx
+++ b/templates/working/Акт_приемки_рекламных_услуг.docx
@@ -1184,7 +1184,7 @@
           <w:sz w:val="24"/>
           <w:szCs w:val="24"/>
         </w:rPr>
-        <w:t>Потребитель _______________________/ {{owner1.initials}}</w:t>
+        <w:t>Потребитель _______________________/ {{owner1.signatoryInitials}}</w:t>
       </w:r>
     </w:p>
     <w:p>
@@ -1239,7 +1239,7 @@
           <w:sz w:val="24"/>
           <w:szCs w:val="24"/>
         </w:rPr>
-        <w:t>Потребитель _______________________/ {{owner2.initials}}</w:t>
+        <w:t>Потребитель _______________________/ {{owner2.signatoryInitials}}</w:t>
       </w:r>
     </w:p>
     <w:p>
@@ -1309,7 +1309,7 @@
           <w:sz w:val="24"/>
           <w:szCs w:val="24"/>
         </w:rPr>
-        <w:t>Потребитель _______________________/ {{owner3.initials}}</w:t>
+        <w:t>Потребитель _______________________/ {{owner3.signatoryInitials}}</w:t>
       </w:r>
     </w:p>
     <w:p>

</xml_diff>